<commit_message>
Atualizações da validação da ViT
</commit_message>
<xml_diff>
--- a/Network_Validation/Roteiro de Apresentação.docx
+++ b/Network_Validation/Roteiro de Apresentação.docx
@@ -325,13 +325,8 @@
       <w:r>
         <w:t xml:space="preserve">. </w:t>
       </w:r>
-      <w:proofErr w:type="gramStart"/>
-      <w:r>
-        <w:t>Por</w:t>
-      </w:r>
-      <w:proofErr w:type="gramEnd"/>
-      <w:r>
-        <w:t xml:space="preserve"> ser um formato binário contínuo, </w:t>
+      <w:r>
+        <w:t xml:space="preserve">Por ser um formato binário contínuo, </w:t>
       </w:r>
       <w:proofErr w:type="spellStart"/>
       <w:r>
@@ -2219,6 +2214,7 @@
         <w:rPr>
           <w:b/>
           <w:bCs/>
+          <w:noProof/>
         </w:rPr>
         <w:drawing>
           <wp:inline distT="0" distB="0" distL="0" distR="0" wp14:anchorId="32FD9E62" wp14:editId="13F92B8C">
@@ -2300,6 +2296,7 @@
         <w:rPr>
           <w:b/>
           <w:bCs/>
+          <w:noProof/>
         </w:rPr>
         <w:drawing>
           <wp:inline distT="0" distB="0" distL="0" distR="0" wp14:anchorId="6F611C24" wp14:editId="3511E6B5">
@@ -3148,14 +3145,7 @@
           <w:b/>
           <w:bCs/>
         </w:rPr>
-        <w:t>Pré-processamento</w:t>
-      </w:r>
-      <w:r>
-        <w:rPr>
-          <w:b/>
-          <w:bCs/>
-        </w:rPr>
-        <w:t>:</w:t>
+        <w:t>Pré-processamento:</w:t>
       </w:r>
       <w:r>
         <w:rPr>
@@ -3178,14 +3168,7 @@
           <w:b/>
           <w:bCs/>
         </w:rPr>
-        <w:t>T</w:t>
-      </w:r>
-      <w:r>
-        <w:rPr>
-          <w:b/>
-          <w:bCs/>
-        </w:rPr>
-        <w:t>reino:</w:t>
+        <w:t>Treino:</w:t>
       </w:r>
       <w:r>
         <w:t xml:space="preserve"> </w:t>
@@ -3983,6 +3966,7 @@
       </w:pPr>
       <w:r>
         <w:rPr>
+          <w:noProof/>
           <w:color w:val="EE0000"/>
         </w:rPr>
         <w:drawing>
@@ -4052,6 +4036,7 @@
       </w:pPr>
       <w:r>
         <w:rPr>
+          <w:noProof/>
           <w:color w:val="EE0000"/>
         </w:rPr>
         <w:drawing>
@@ -4748,6 +4733,7 @@
       </w:pPr>
       <w:r>
         <w:rPr>
+          <w:noProof/>
           <w:color w:val="0D0D0D" w:themeColor="text1" w:themeTint="F2"/>
         </w:rPr>
         <w:drawing>
@@ -4895,17 +4881,7 @@
           <w:sz w:val="22"/>
           <w:szCs w:val="22"/>
         </w:rPr>
-        <w:t xml:space="preserve">- </w:t>
-      </w:r>
-      <w:r>
-        <w:rPr>
-          <w:rFonts w:asciiTheme="minorHAnsi" w:hAnsiTheme="minorHAnsi" w:cstheme="minorHAnsi"/>
-          <w:b/>
-          <w:bCs/>
-          <w:sz w:val="22"/>
-          <w:szCs w:val="22"/>
-        </w:rPr>
-        <w:t xml:space="preserve">Resolução de entrada: </w:t>
+        <w:t xml:space="preserve">- Resolução de entrada: </w:t>
       </w:r>
       <w:r>
         <w:rPr>
@@ -4935,17 +4911,7 @@
           <w:sz w:val="22"/>
           <w:szCs w:val="22"/>
         </w:rPr>
-        <w:t xml:space="preserve">- </w:t>
-      </w:r>
-      <w:r>
-        <w:rPr>
-          <w:rFonts w:asciiTheme="minorHAnsi" w:hAnsiTheme="minorHAnsi" w:cstheme="minorHAnsi"/>
-          <w:b/>
-          <w:bCs/>
-          <w:sz w:val="22"/>
-          <w:szCs w:val="22"/>
-        </w:rPr>
-        <w:t>Otimizador:</w:t>
+        <w:t>- Otimizador:</w:t>
       </w:r>
       <w:r>
         <w:rPr>
@@ -5031,17 +4997,7 @@
           <w:sz w:val="22"/>
           <w:szCs w:val="22"/>
         </w:rPr>
-        <w:t xml:space="preserve">- </w:t>
-      </w:r>
-      <w:r>
-        <w:rPr>
-          <w:rFonts w:asciiTheme="minorHAnsi" w:hAnsiTheme="minorHAnsi" w:cstheme="minorHAnsi"/>
-          <w:b/>
-          <w:bCs/>
-          <w:sz w:val="22"/>
-          <w:szCs w:val="22"/>
-        </w:rPr>
-        <w:t xml:space="preserve">Batch </w:t>
+        <w:t xml:space="preserve">- Batch </w:t>
       </w:r>
       <w:proofErr w:type="spellStart"/>
       <w:r>
@@ -5205,17 +5161,7 @@
           <w:sz w:val="22"/>
           <w:szCs w:val="22"/>
         </w:rPr>
-        <w:t xml:space="preserve">- </w:t>
-      </w:r>
-      <w:r>
-        <w:rPr>
-          <w:rFonts w:asciiTheme="minorHAnsi" w:hAnsiTheme="minorHAnsi" w:cstheme="minorHAnsi"/>
-          <w:b/>
-          <w:bCs/>
-          <w:sz w:val="22"/>
-          <w:szCs w:val="22"/>
-        </w:rPr>
-        <w:t>Learning rate:</w:t>
+        <w:t>- Learning rate:</w:t>
       </w:r>
       <w:r>
         <w:rPr>
@@ -5280,17 +5226,7 @@
           <w:sz w:val="22"/>
           <w:szCs w:val="22"/>
         </w:rPr>
-        <w:t xml:space="preserve">- </w:t>
-      </w:r>
-      <w:r>
-        <w:rPr>
-          <w:rFonts w:asciiTheme="minorHAnsi" w:hAnsiTheme="minorHAnsi" w:cstheme="minorHAnsi"/>
-          <w:b/>
-          <w:bCs/>
-          <w:sz w:val="22"/>
-          <w:szCs w:val="22"/>
-        </w:rPr>
-        <w:t>Decaimento:</w:t>
+        <w:t>- Decaimento:</w:t>
       </w:r>
       <w:r>
         <w:rPr>
@@ -5648,17 +5584,7 @@
           <w:sz w:val="22"/>
           <w:szCs w:val="22"/>
         </w:rPr>
-        <w:t xml:space="preserve">- </w:t>
-      </w:r>
-      <w:r>
-        <w:rPr>
-          <w:rFonts w:asciiTheme="minorHAnsi" w:hAnsiTheme="minorHAnsi" w:cstheme="minorHAnsi"/>
-          <w:b/>
-          <w:bCs/>
-          <w:sz w:val="22"/>
-          <w:szCs w:val="22"/>
-        </w:rPr>
-        <w:t>Fine-</w:t>
+        <w:t>- Fine-</w:t>
       </w:r>
       <w:proofErr w:type="spellStart"/>
       <w:r>
@@ -5779,6 +5705,7 @@
       <w:r>
         <w:rPr>
           <w:rFonts w:asciiTheme="minorHAnsi" w:hAnsiTheme="minorHAnsi" w:cstheme="minorHAnsi"/>
+          <w:noProof/>
           <w:sz w:val="22"/>
           <w:szCs w:val="22"/>
         </w:rPr>
@@ -6024,6 +5951,7 @@
         <w:rPr>
           <w:b/>
           <w:bCs/>
+          <w:noProof/>
         </w:rPr>
         <w:drawing>
           <wp:inline distT="0" distB="0" distL="0" distR="0" wp14:anchorId="7FC37BB8" wp14:editId="1B12141C">
@@ -6093,7 +6021,23 @@
           <w:b/>
           <w:bCs/>
         </w:rPr>
-        <w:t xml:space="preserve"> pré-treinados</w:t>
+        <w:t xml:space="preserve"> </w:t>
+      </w:r>
+      <w:proofErr w:type="spellStart"/>
+      <w:r>
+        <w:rPr>
+          <w:b/>
+          <w:bCs/>
+        </w:rPr>
+        <w:t>pré</w:t>
+      </w:r>
+      <w:proofErr w:type="spellEnd"/>
+      <w:r>
+        <w:rPr>
+          <w:b/>
+          <w:bCs/>
+        </w:rPr>
+        <w:t>-treinados</w:t>
       </w:r>
     </w:p>
     <w:p>
@@ -6144,6 +6088,7 @@
         <w:rPr>
           <w:b/>
           <w:bCs/>
+          <w:noProof/>
         </w:rPr>
         <w:drawing>
           <wp:inline distT="0" distB="0" distL="0" distR="0" wp14:anchorId="3306E864" wp14:editId="09CF6819">
@@ -6260,12 +6205,119 @@
     </w:p>
     <w:p>
       <w:pPr>
-        <w:rPr>
-          <w:b/>
-          <w:bCs/>
-          <w:color w:val="C00000"/>
-        </w:rPr>
-      </w:pPr>
+        <w:ind w:left="1776"/>
+        <w:rPr>
+          <w:b/>
+          <w:bCs/>
+        </w:rPr>
+      </w:pPr>
+      <w:r>
+        <w:rPr>
+          <w:b/>
+          <w:bCs/>
+        </w:rPr>
+        <w:t>OBSERVAÇÃO 1:</w:t>
+      </w:r>
+    </w:p>
+    <w:p>
+      <w:pPr>
+        <w:ind w:left="708"/>
+        <w:rPr>
+          <w:b/>
+          <w:bCs/>
+        </w:rPr>
+      </w:pPr>
+      <w:r>
+        <w:rPr>
+          <w:b/>
+          <w:bCs/>
+        </w:rPr>
+        <w:drawing>
+          <wp:inline distT="0" distB="0" distL="0" distR="0" wp14:anchorId="3C150F9E" wp14:editId="782FE7EF">
+            <wp:extent cx="5400040" cy="781685"/>
+            <wp:effectExtent l="0" t="0" r="0" b="0"/>
+            <wp:docPr id="1005225276" name="Imagem 1"/>
+            <wp:cNvGraphicFramePr>
+              <a:graphicFrameLocks xmlns:a="http://schemas.openxmlformats.org/drawingml/2006/main" noChangeAspect="1"/>
+            </wp:cNvGraphicFramePr>
+            <a:graphic xmlns:a="http://schemas.openxmlformats.org/drawingml/2006/main">
+              <a:graphicData uri="http://schemas.openxmlformats.org/drawingml/2006/picture">
+                <pic:pic xmlns:pic="http://schemas.openxmlformats.org/drawingml/2006/picture">
+                  <pic:nvPicPr>
+                    <pic:cNvPr id="1005225276" name=""/>
+                    <pic:cNvPicPr/>
+                  </pic:nvPicPr>
+                  <pic:blipFill>
+                    <a:blip r:embed="rId22"/>
+                    <a:stretch>
+                      <a:fillRect/>
+                    </a:stretch>
+                  </pic:blipFill>
+                  <pic:spPr>
+                    <a:xfrm>
+                      <a:off x="0" y="0"/>
+                      <a:ext cx="5400040" cy="781685"/>
+                    </a:xfrm>
+                    <a:prstGeom prst="rect">
+                      <a:avLst/>
+                    </a:prstGeom>
+                  </pic:spPr>
+                </pic:pic>
+              </a:graphicData>
+            </a:graphic>
+          </wp:inline>
+        </w:drawing>
+      </w:r>
+    </w:p>
+    <w:p>
+      <w:pPr>
+        <w:ind w:left="708"/>
+        <w:rPr>
+          <w:b/>
+          <w:bCs/>
+        </w:rPr>
+      </w:pPr>
+      <w:r>
+        <w:rPr>
+          <w:b/>
+          <w:bCs/>
+        </w:rPr>
+        <w:drawing>
+          <wp:inline distT="0" distB="0" distL="0" distR="0" wp14:anchorId="064BD09C" wp14:editId="18C07C17">
+            <wp:extent cx="5400040" cy="3547745"/>
+            <wp:effectExtent l="0" t="0" r="0" b="0"/>
+            <wp:docPr id="190380662" name="Imagem 1"/>
+            <wp:cNvGraphicFramePr>
+              <a:graphicFrameLocks xmlns:a="http://schemas.openxmlformats.org/drawingml/2006/main" noChangeAspect="1"/>
+            </wp:cNvGraphicFramePr>
+            <a:graphic xmlns:a="http://schemas.openxmlformats.org/drawingml/2006/main">
+              <a:graphicData uri="http://schemas.openxmlformats.org/drawingml/2006/picture">
+                <pic:pic xmlns:pic="http://schemas.openxmlformats.org/drawingml/2006/picture">
+                  <pic:nvPicPr>
+                    <pic:cNvPr id="190380662" name=""/>
+                    <pic:cNvPicPr/>
+                  </pic:nvPicPr>
+                  <pic:blipFill>
+                    <a:blip r:embed="rId23"/>
+                    <a:stretch>
+                      <a:fillRect/>
+                    </a:stretch>
+                  </pic:blipFill>
+                  <pic:spPr>
+                    <a:xfrm>
+                      <a:off x="0" y="0"/>
+                      <a:ext cx="5400040" cy="3547745"/>
+                    </a:xfrm>
+                    <a:prstGeom prst="rect">
+                      <a:avLst/>
+                    </a:prstGeom>
+                  </pic:spPr>
+                </pic:pic>
+              </a:graphicData>
+            </a:graphic>
+          </wp:inline>
+        </w:drawing>
+      </w:r>
     </w:p>
     <w:p>
       <w:pPr>
@@ -13945,6 +13997,7 @@
   <w:style w:type="character" w:default="1" w:styleId="Fontepargpadro">
     <w:name w:val="Default Paragraph Font"/>
     <w:uiPriority w:val="1"/>
+    <w:semiHidden/>
     <w:unhideWhenUsed/>
   </w:style>
   <w:style w:type="table" w:default="1" w:styleId="Tabelanormal">
@@ -14407,6 +14460,18 @@
       <w:color w:val="666666"/>
     </w:rPr>
   </w:style>
+  <w:style w:type="character" w:styleId="HiperlinkVisitado">
+    <w:name w:val="FollowedHyperlink"/>
+    <w:basedOn w:val="Fontepargpadro"/>
+    <w:uiPriority w:val="99"/>
+    <w:semiHidden/>
+    <w:unhideWhenUsed/>
+    <w:rsid w:val="00BC0134"/>
+    <w:rPr>
+      <w:color w:val="954F72" w:themeColor="followedHyperlink"/>
+      <w:u w:val="single"/>
+    </w:rPr>
+  </w:style>
 </w:styles>
 </file>
 

</xml_diff>